<commit_message>
Document Amazon ordering findings and add QTY/pack defect to Parking Lot
- CURRENT_STATUS.md: Update ordering method note — Track A deferred (not permanently
  abandoned), bulk upload tool confirmed to work for per-student orders but not bulk
  pricing. Add 2027 Request Quotes strategy, QTY/pack audit item, firm pillow backup
  SKU (B0BY7T3K2R), and Request Quotes timing reminder to Open Items.

- PARKING_LOT.md: Add P-013 — QTY PER STUDENT vs. pack size defect. Add UNITS PER PACK
  column to catalog; order qty = ceil(QTY PER STUDENT / UNITS PER PACK). Full catalog
  audit needed before 2027 Phase 2A.

- CRF_Grant_Fulfillment_Operations_Manual_v4.docx: Update Section 6.1 to reflect bulk
  upload tool evaluation and deferred (not abandoned) Track A status; add Request Quotes
  paragraph for 2027 strategy. Add QTY/pack size troubleshooting row to Section 7.4.

Co-Authored-By: Claude Sonnet 4.6 <noreply@anthropic.com>
</commit_message>
<xml_diff>
--- a/Campus_Ready_Project_Files/CRF_Grant_Fulfillment_Operations_Manual_v4.docx
+++ b/Campus_Ready_Project_Files/CRF_Grant_Fulfillment_Operations_Manual_v4.docx
@@ -10345,7 +10345,20 @@
           <w:sz w:val="22"/>
           <w:szCs w:val="22"/>
         </w:rPr>
-        <w:t xml:space="preserve">Choice items (bedding, towels, personal care, accessories, and any choice-driven universal items) are ordered using one Amazon Business List per student. Each list merges Universal and Choice items into a single combined list, and a separate checkout is placed for each student. This replaces the previously considered Track A approach (Amazon “Ship to Multiple Addresses” for choice items), which was abandoned after direct confirmation with Amazon that manual address selection and per-item shipping instructions are still required at checkout regardless of the feature, and bulk-discount eligibility is uncertain (DEC-063). Revisit for 2027 if Amazon offers a better bulk mechanism for choice items.</w:t>
+        <w:t xml:space="preserve">Choice items (bedding, towels, personal care, accessories, and any choice-driven universal items) are ordered using one Amazon Business List per student. Each list merges Universal and Choice items into a single combined list, and a separate checkout is placed for each student. Amazon’s bulk upload tool was evaluated and confirmed to work — uploading a student’s product list automatically creates a ready-to-place order. It does not enable bulk pricing on individual products across students. Track A (Amazon “Ship to Multiple Addresses”) is deferred, not permanently abandoned; revisit for 2027 (DEC-063).</w:t>
+      </w:r>
+    </w:p>
+    <w:p>
+      <w:pPr>
+        <w:spacing w:after="120"/>
+      </w:pPr>
+      <w:r>
+        <w:rPr>
+          <w:rFonts w:ascii="Arial" w:cs="Arial" w:eastAsia="Arial" w:hAnsi="Arial"/>
+          <w:sz w:val="22"/>
+          <w:szCs w:val="22"/>
+        </w:rPr>
+        <w:t xml:space="preserve">2027 ordering strategy — Amazon Request Quotes: Amazon Business accounts support Request for Quote (RFQ). As soon as the product catalog is finalized for the 2027 cohort (typically October–November), submit an RFQ covering the full bulk quantities needed across all students. This engages sellers directly and allows pricing negotiation before any orders are placed. Initiate quote requests at least two weeks before the ordering window opens so responses can be evaluated and individual-product pricing compared against standard Business pricing.</w:t>
       </w:r>
     </w:p>
     <w:p>
@@ -13561,6 +13574,95 @@
                 <w:szCs w:val="20"/>
               </w:rPr>
               <w:t xml:space="preserve">For Vanilla &amp; Botanicals: apply Soft &amp; Floral fallback manually (DEC-067). For other combinations: add missing product to research tab and rebuild Product Logic. Until P-012 is implemented, always diff resolved output against expected categories before generating Shopping List.</w:t>
+            </w:r>
+          </w:p>
+        </w:tc>
+      </w:tr>
+      <w:tr>
+        <w:tc>
+          <w:tcPr>
+            <w:tcW w:type="dxa" w:w="2500"/>
+            <w:tcBorders>
+              <w:top w:val="single" w:color="CCCCCC" w:sz="1"/>
+              <w:left w:val="single" w:color="CCCCCC" w:sz="1"/>
+              <w:bottom w:val="single" w:color="CCCCCC" w:sz="1"/>
+              <w:right w:val="single" w:color="CCCCCC" w:sz="1"/>
+            </w:tcBorders>
+            <w:shd w:fill="F5F5F5" w:val="clear"/>
+            <w:tcMar>
+              <w:top w:type="dxa" w:w="60"/>
+              <w:left w:type="dxa" w:w="100"/>
+              <w:bottom w:type="dxa" w:w="60"/>
+              <w:right w:type="dxa" w:w="100"/>
+            </w:tcMar>
+          </w:tcPr>
+          <w:p>
+            <w:r>
+              <w:rPr>
+                <w:rFonts w:ascii="Arial" w:cs="Arial" w:eastAsia="Arial" w:hAnsi="Arial"/>
+                <w:color w:val="000000"/>
+                <w:sz w:val="20"/>
+                <w:szCs w:val="20"/>
+              </w:rPr>
+              <w:t xml:space="preserve">Order quantity produces 2× or 4× the needed item count</w:t>
+            </w:r>
+          </w:p>
+        </w:tc>
+        <w:tc>
+          <w:tcPr>
+            <w:tcW w:type="dxa" w:w="3000"/>
+            <w:tcBorders>
+              <w:top w:val="single" w:color="CCCCCC" w:sz="1"/>
+              <w:left w:val="single" w:color="CCCCCC" w:sz="1"/>
+              <w:bottom w:val="single" w:color="CCCCCC" w:sz="1"/>
+              <w:right w:val="single" w:color="CCCCCC" w:sz="1"/>
+            </w:tcBorders>
+            <w:shd w:fill="F5F5F5" w:val="clear"/>
+            <w:tcMar>
+              <w:top w:type="dxa" w:w="60"/>
+              <w:left w:type="dxa" w:w="100"/>
+              <w:bottom w:type="dxa" w:w="60"/>
+              <w:right w:type="dxa" w:w="100"/>
+            </w:tcMar>
+          </w:tcPr>
+          <w:p>
+            <w:r>
+              <w:rPr>
+                <w:rFonts w:ascii="Arial" w:cs="Arial" w:eastAsia="Arial" w:hAnsi="Arial"/>
+                <w:color w:val="000000"/>
+                <w:sz w:val="20"/>
+                <w:szCs w:val="20"/>
+              </w:rPr>
+              <w:t xml:space="preserve">SKU is a multi-unit pack (e.g., pillow Set of 2, storage 4-pack); QTY PER STUDENT ÷ UNITS PER PACK has not been applied</w:t>
+            </w:r>
+          </w:p>
+        </w:tc>
+        <w:tc>
+          <w:tcPr>
+            <w:tcW w:type="dxa" w:w="3000"/>
+            <w:tcBorders>
+              <w:top w:val="single" w:color="CCCCCC" w:sz="1"/>
+              <w:left w:val="single" w:color="CCCCCC" w:sz="1"/>
+              <w:bottom w:val="single" w:color="CCCCCC" w:sz="1"/>
+              <w:right w:val="single" w:color="CCCCCC" w:sz="1"/>
+            </w:tcBorders>
+            <w:shd w:fill="F5F5F5" w:val="clear"/>
+            <w:tcMar>
+              <w:top w:type="dxa" w:w="60"/>
+              <w:left w:type="dxa" w:w="100"/>
+              <w:bottom w:type="dxa" w:w="60"/>
+              <w:right w:type="dxa" w:w="100"/>
+            </w:tcMar>
+          </w:tcPr>
+          <w:p>
+            <w:r>
+              <w:rPr>
+                <w:rFonts w:ascii="Arial" w:cs="Arial" w:eastAsia="Arial" w:hAnsi="Arial"/>
+                <w:color w:val="000000"/>
+                <w:sz w:val="20"/>
+                <w:szCs w:val="20"/>
+              </w:rPr>
+              <w:t xml:space="preserve">Check UNITS PER PACK in catalog; order qty = ceil(QTY PER STUDENT / UNITS PER PACK). See P-013 in PARKING_LOT.md for full catalog audit scope.</w:t>
             </w:r>
           </w:p>
         </w:tc>

</xml_diff>